<commit_message>
Add user-controlled memory management
</commit_message>
<xml_diff>
--- a/docs/Personal_Agent_AI协作与项目演进全记录.docx
+++ b/docs/Personal_Agent_AI协作与项目演进全记录.docx
@@ -2758,6 +2758,38 @@
       </w:r>
     </w:p>
     <w:p>
+      <w:pPr>
+        <w:pStyle w:val="ListBullet"/>
+        <w:spacing w:after="80"/>
+        <w:ind w:left="360" w:hanging="259"/>
+      </w:pPr>
+      <w:r>
+        <w:rPr>
+          <w:rFonts w:ascii="Calibri" w:hAnsi="Calibri" w:eastAsia="Microsoft YaHei"/>
+          <w:b w:val="0"/>
+          <w:color w:val="20242C"/>
+          <w:sz w:val="22"/>
+        </w:rPr>
+        <w:t>正式记忆支持状态筛选、详情、Provenance、Evidence 和 JSON 查看。</w:t>
+      </w:r>
+    </w:p>
+    <w:p>
+      <w:pPr>
+        <w:pStyle w:val="ListBullet"/>
+        <w:spacing w:after="80"/>
+        <w:ind w:left="360" w:hanging="259"/>
+      </w:pPr>
+      <w:r>
+        <w:rPr>
+          <w:rFonts w:ascii="Calibri" w:hAnsi="Calibri" w:eastAsia="Microsoft YaHei"/>
+          <w:b w:val="0"/>
+          <w:color w:val="20242C"/>
+          <w:sz w:val="22"/>
+        </w:rPr>
+        <w:t>用户可以编辑类型、内容、重要性和状态，并通过生命周期软删除记忆。</w:t>
+      </w:r>
+    </w:p>
+    <w:p>
       <w:r>
         <w:rPr>
           <w:rFonts w:ascii="Calibri" w:hAnsi="Calibri" w:eastAsia="Microsoft YaHei"/>
@@ -4570,7 +4602,7 @@
           <w:color w:val="1F4D78"/>
           <w:sz w:val="18"/>
         </w:rPr>
-        <w:t>84 passed</w:t>
+        <w:t>93 passed</w:t>
       </w:r>
       <w:r>
         <w:br/>
@@ -4925,7 +4957,7 @@
           <w:color w:val="20242C"/>
           <w:sz w:val="22"/>
         </w:rPr>
-        <w:t>运行 84 项测试。</w:t>
+        <w:t>运行 93 项测试。</w:t>
       </w:r>
     </w:p>
     <w:p>
@@ -6837,7 +6869,7 @@
           <w:color w:val="20242C"/>
           <w:sz w:val="22"/>
         </w:rPr>
-        <w:t>84 项自动化测试。</w:t>
+        <w:t>93 项自动化测试。</w:t>
       </w:r>
     </w:p>
     <w:p>

</xml_diff>